<commit_message>
Alterações nos documentos de Estágio.
</commit_message>
<xml_diff>
--- a/Faculdade/Anexo C - Regulamento das Atividades Complementares.docx
+++ b/Faculdade/Anexo C - Regulamento das Atividades Complementares.docx
@@ -420,14 +420,34 @@
                 <w:szCs w:val="20"/>
               </w:rPr>
             </w:pPr>
-            <w:r>
-              <w:rPr>
-                <w:rFonts w:ascii="Arial" w:hAnsi="Arial" w:cs="Arial"/>
-                <w:sz w:val="20"/>
-                <w:szCs w:val="20"/>
-              </w:rPr>
-              <w:t>Artigos científicos</w:t>
-            </w:r>
+            <w:proofErr w:type="spellStart"/>
+            <w:r>
+              <w:rPr>
+                <w:rFonts w:ascii="Arial" w:hAnsi="Arial" w:cs="Arial"/>
+                <w:sz w:val="20"/>
+                <w:szCs w:val="20"/>
+              </w:rPr>
+              <w:t>Artigos</w:t>
+            </w:r>
+            <w:proofErr w:type="spellEnd"/>
+            <w:r>
+              <w:rPr>
+                <w:rFonts w:ascii="Arial" w:hAnsi="Arial" w:cs="Arial"/>
+                <w:sz w:val="20"/>
+                <w:szCs w:val="20"/>
+              </w:rPr>
+              <w:t xml:space="preserve"> </w:t>
+            </w:r>
+            <w:proofErr w:type="spellStart"/>
+            <w:r>
+              <w:rPr>
+                <w:rFonts w:ascii="Arial" w:hAnsi="Arial" w:cs="Arial"/>
+                <w:sz w:val="20"/>
+                <w:szCs w:val="20"/>
+              </w:rPr>
+              <w:t>científicos</w:t>
+            </w:r>
+            <w:proofErr w:type="spellEnd"/>
           </w:p>
         </w:tc>
         <w:tc>
@@ -493,14 +513,52 @@
                 <w:szCs w:val="20"/>
               </w:rPr>
             </w:pPr>
-            <w:r>
-              <w:rPr>
-                <w:rFonts w:ascii="Arial" w:hAnsi="Arial" w:cs="Arial"/>
-                <w:sz w:val="20"/>
-                <w:szCs w:val="20"/>
-              </w:rPr>
-              <w:t>Pesquisa de Iniciação Científica</w:t>
-            </w:r>
+            <w:proofErr w:type="spellStart"/>
+            <w:r>
+              <w:rPr>
+                <w:rFonts w:ascii="Arial" w:hAnsi="Arial" w:cs="Arial"/>
+                <w:sz w:val="20"/>
+                <w:szCs w:val="20"/>
+              </w:rPr>
+              <w:t>Pesquisa</w:t>
+            </w:r>
+            <w:proofErr w:type="spellEnd"/>
+            <w:r>
+              <w:rPr>
+                <w:rFonts w:ascii="Arial" w:hAnsi="Arial" w:cs="Arial"/>
+                <w:sz w:val="20"/>
+                <w:szCs w:val="20"/>
+              </w:rPr>
+              <w:t xml:space="preserve"> de </w:t>
+            </w:r>
+            <w:proofErr w:type="spellStart"/>
+            <w:r>
+              <w:rPr>
+                <w:rFonts w:ascii="Arial" w:hAnsi="Arial" w:cs="Arial"/>
+                <w:sz w:val="20"/>
+                <w:szCs w:val="20"/>
+              </w:rPr>
+              <w:t>Iniciação</w:t>
+            </w:r>
+            <w:proofErr w:type="spellEnd"/>
+            <w:r>
+              <w:rPr>
+                <w:rFonts w:ascii="Arial" w:hAnsi="Arial" w:cs="Arial"/>
+                <w:sz w:val="20"/>
+                <w:szCs w:val="20"/>
+              </w:rPr>
+              <w:t xml:space="preserve"> </w:t>
+            </w:r>
+            <w:proofErr w:type="spellStart"/>
+            <w:r>
+              <w:rPr>
+                <w:rFonts w:ascii="Arial" w:hAnsi="Arial" w:cs="Arial"/>
+                <w:sz w:val="20"/>
+                <w:szCs w:val="20"/>
+              </w:rPr>
+              <w:t>Científica</w:t>
+            </w:r>
+            <w:proofErr w:type="spellEnd"/>
           </w:p>
         </w:tc>
         <w:tc>
@@ -526,6 +584,7 @@
               </w:rPr>
               <w:t xml:space="preserve">Pesquisa realizada sob a orientação de um docente, obedecendo às diretrizes do regimento de Iniciação Científica  do </w:t>
             </w:r>
+            <w:proofErr w:type="spellStart"/>
             <w:r>
               <w:rPr>
                 <w:rFonts w:ascii="Arial" w:hAnsi="Arial" w:cs="Arial"/>
@@ -537,6 +596,7 @@
               </w:rPr>
               <w:t>Uni-FACEF</w:t>
             </w:r>
+            <w:proofErr w:type="spellEnd"/>
             <w:r>
               <w:rPr>
                 <w:rFonts w:ascii="Arial" w:hAnsi="Arial" w:cs="Arial"/>
@@ -586,14 +646,70 @@
                 <w:szCs w:val="20"/>
               </w:rPr>
             </w:pPr>
-            <w:r>
-              <w:rPr>
-                <w:rFonts w:ascii="Arial" w:hAnsi="Arial" w:cs="Arial"/>
-                <w:sz w:val="20"/>
-                <w:szCs w:val="20"/>
-              </w:rPr>
-              <w:t>Eventos científicos ou culturais</w:t>
-            </w:r>
+            <w:proofErr w:type="spellStart"/>
+            <w:r>
+              <w:rPr>
+                <w:rFonts w:ascii="Arial" w:hAnsi="Arial" w:cs="Arial"/>
+                <w:sz w:val="20"/>
+                <w:szCs w:val="20"/>
+              </w:rPr>
+              <w:t>Eventos</w:t>
+            </w:r>
+            <w:proofErr w:type="spellEnd"/>
+            <w:r>
+              <w:rPr>
+                <w:rFonts w:ascii="Arial" w:hAnsi="Arial" w:cs="Arial"/>
+                <w:sz w:val="20"/>
+                <w:szCs w:val="20"/>
+              </w:rPr>
+              <w:t xml:space="preserve"> </w:t>
+            </w:r>
+            <w:proofErr w:type="spellStart"/>
+            <w:r>
+              <w:rPr>
+                <w:rFonts w:ascii="Arial" w:hAnsi="Arial" w:cs="Arial"/>
+                <w:sz w:val="20"/>
+                <w:szCs w:val="20"/>
+              </w:rPr>
+              <w:t>científicos</w:t>
+            </w:r>
+            <w:proofErr w:type="spellEnd"/>
+            <w:r>
+              <w:rPr>
+                <w:rFonts w:ascii="Arial" w:hAnsi="Arial" w:cs="Arial"/>
+                <w:sz w:val="20"/>
+                <w:szCs w:val="20"/>
+              </w:rPr>
+              <w:t xml:space="preserve"> </w:t>
+            </w:r>
+            <w:proofErr w:type="spellStart"/>
+            <w:r>
+              <w:rPr>
+                <w:rFonts w:ascii="Arial" w:hAnsi="Arial" w:cs="Arial"/>
+                <w:sz w:val="20"/>
+                <w:szCs w:val="20"/>
+              </w:rPr>
+              <w:t>ou</w:t>
+            </w:r>
+            <w:proofErr w:type="spellEnd"/>
+            <w:r>
+              <w:rPr>
+                <w:rFonts w:ascii="Arial" w:hAnsi="Arial" w:cs="Arial"/>
+                <w:sz w:val="20"/>
+                <w:szCs w:val="20"/>
+              </w:rPr>
+              <w:t xml:space="preserve"> </w:t>
+            </w:r>
+            <w:proofErr w:type="spellStart"/>
+            <w:r>
+              <w:rPr>
+                <w:rFonts w:ascii="Arial" w:hAnsi="Arial" w:cs="Arial"/>
+                <w:sz w:val="20"/>
+                <w:szCs w:val="20"/>
+              </w:rPr>
+              <w:t>culturais</w:t>
+            </w:r>
+            <w:proofErr w:type="spellEnd"/>
           </w:p>
         </w:tc>
         <w:tc>
@@ -617,7 +733,27 @@
                 <w:szCs w:val="20"/>
                 <w:lang w:val="pt-BR"/>
               </w:rPr>
-              <w:t xml:space="preserve">Palestras, workshops, conferências, mesas-redondas etc, em que o discente </w:t>
+              <w:t xml:space="preserve">Palestras, workshops, conferências, mesas-redondas </w:t>
+            </w:r>
+            <w:proofErr w:type="spellStart"/>
+            <w:r>
+              <w:rPr>
+                <w:rFonts w:ascii="Arial" w:hAnsi="Arial" w:cs="Arial"/>
+                <w:sz w:val="20"/>
+                <w:szCs w:val="20"/>
+                <w:lang w:val="pt-BR"/>
+              </w:rPr>
+              <w:t>etc</w:t>
+            </w:r>
+            <w:proofErr w:type="spellEnd"/>
+            <w:r>
+              <w:rPr>
+                <w:rFonts w:ascii="Arial" w:hAnsi="Arial" w:cs="Arial"/>
+                <w:sz w:val="20"/>
+                <w:szCs w:val="20"/>
+                <w:lang w:val="pt-BR"/>
+              </w:rPr>
+              <w:t xml:space="preserve">, em que o discente </w:t>
             </w:r>
             <w:r>
               <w:rPr>
@@ -679,14 +815,70 @@
                 <w:szCs w:val="20"/>
               </w:rPr>
             </w:pPr>
-            <w:r>
-              <w:rPr>
-                <w:rFonts w:ascii="Arial" w:hAnsi="Arial" w:cs="Arial"/>
-                <w:sz w:val="20"/>
-                <w:szCs w:val="20"/>
-              </w:rPr>
-              <w:t>Eventos científicos ou culturais</w:t>
-            </w:r>
+            <w:proofErr w:type="spellStart"/>
+            <w:r>
+              <w:rPr>
+                <w:rFonts w:ascii="Arial" w:hAnsi="Arial" w:cs="Arial"/>
+                <w:sz w:val="20"/>
+                <w:szCs w:val="20"/>
+              </w:rPr>
+              <w:t>Eventos</w:t>
+            </w:r>
+            <w:proofErr w:type="spellEnd"/>
+            <w:r>
+              <w:rPr>
+                <w:rFonts w:ascii="Arial" w:hAnsi="Arial" w:cs="Arial"/>
+                <w:sz w:val="20"/>
+                <w:szCs w:val="20"/>
+              </w:rPr>
+              <w:t xml:space="preserve"> </w:t>
+            </w:r>
+            <w:proofErr w:type="spellStart"/>
+            <w:r>
+              <w:rPr>
+                <w:rFonts w:ascii="Arial" w:hAnsi="Arial" w:cs="Arial"/>
+                <w:sz w:val="20"/>
+                <w:szCs w:val="20"/>
+              </w:rPr>
+              <w:t>científicos</w:t>
+            </w:r>
+            <w:proofErr w:type="spellEnd"/>
+            <w:r>
+              <w:rPr>
+                <w:rFonts w:ascii="Arial" w:hAnsi="Arial" w:cs="Arial"/>
+                <w:sz w:val="20"/>
+                <w:szCs w:val="20"/>
+              </w:rPr>
+              <w:t xml:space="preserve"> </w:t>
+            </w:r>
+            <w:proofErr w:type="spellStart"/>
+            <w:r>
+              <w:rPr>
+                <w:rFonts w:ascii="Arial" w:hAnsi="Arial" w:cs="Arial"/>
+                <w:sz w:val="20"/>
+                <w:szCs w:val="20"/>
+              </w:rPr>
+              <w:t>ou</w:t>
+            </w:r>
+            <w:proofErr w:type="spellEnd"/>
+            <w:r>
+              <w:rPr>
+                <w:rFonts w:ascii="Arial" w:hAnsi="Arial" w:cs="Arial"/>
+                <w:sz w:val="20"/>
+                <w:szCs w:val="20"/>
+              </w:rPr>
+              <w:t xml:space="preserve"> </w:t>
+            </w:r>
+            <w:proofErr w:type="spellStart"/>
+            <w:r>
+              <w:rPr>
+                <w:rFonts w:ascii="Arial" w:hAnsi="Arial" w:cs="Arial"/>
+                <w:sz w:val="20"/>
+                <w:szCs w:val="20"/>
+              </w:rPr>
+              <w:t>culturais</w:t>
+            </w:r>
+            <w:proofErr w:type="spellEnd"/>
           </w:p>
         </w:tc>
         <w:tc>
@@ -710,7 +902,27 @@
                 <w:szCs w:val="20"/>
                 <w:lang w:val="pt-BR"/>
               </w:rPr>
-              <w:t xml:space="preserve">Palestras, workshops, conferências, mesas-redondas etc, em que o discente participa </w:t>
+              <w:t xml:space="preserve">Palestras, workshops, conferências, mesas-redondas </w:t>
+            </w:r>
+            <w:proofErr w:type="spellStart"/>
+            <w:r>
+              <w:rPr>
+                <w:rFonts w:ascii="Arial" w:hAnsi="Arial" w:cs="Arial"/>
+                <w:sz w:val="20"/>
+                <w:szCs w:val="20"/>
+                <w:lang w:val="pt-BR"/>
+              </w:rPr>
+              <w:t>etc</w:t>
+            </w:r>
+            <w:proofErr w:type="spellEnd"/>
+            <w:r>
+              <w:rPr>
+                <w:rFonts w:ascii="Arial" w:hAnsi="Arial" w:cs="Arial"/>
+                <w:sz w:val="20"/>
+                <w:szCs w:val="20"/>
+                <w:lang w:val="pt-BR"/>
+              </w:rPr>
+              <w:t xml:space="preserve">, em que o discente participa </w:t>
             </w:r>
             <w:r>
               <w:rPr>
@@ -772,14 +984,70 @@
                 <w:szCs w:val="20"/>
               </w:rPr>
             </w:pPr>
-            <w:r>
-              <w:rPr>
-                <w:rFonts w:ascii="Arial" w:hAnsi="Arial" w:cs="Arial"/>
-                <w:sz w:val="20"/>
-                <w:szCs w:val="20"/>
-              </w:rPr>
-              <w:t>Eventos científicos ou culturais</w:t>
-            </w:r>
+            <w:proofErr w:type="spellStart"/>
+            <w:r>
+              <w:rPr>
+                <w:rFonts w:ascii="Arial" w:hAnsi="Arial" w:cs="Arial"/>
+                <w:sz w:val="20"/>
+                <w:szCs w:val="20"/>
+              </w:rPr>
+              <w:t>Eventos</w:t>
+            </w:r>
+            <w:proofErr w:type="spellEnd"/>
+            <w:r>
+              <w:rPr>
+                <w:rFonts w:ascii="Arial" w:hAnsi="Arial" w:cs="Arial"/>
+                <w:sz w:val="20"/>
+                <w:szCs w:val="20"/>
+              </w:rPr>
+              <w:t xml:space="preserve"> </w:t>
+            </w:r>
+            <w:proofErr w:type="spellStart"/>
+            <w:r>
+              <w:rPr>
+                <w:rFonts w:ascii="Arial" w:hAnsi="Arial" w:cs="Arial"/>
+                <w:sz w:val="20"/>
+                <w:szCs w:val="20"/>
+              </w:rPr>
+              <w:t>científicos</w:t>
+            </w:r>
+            <w:proofErr w:type="spellEnd"/>
+            <w:r>
+              <w:rPr>
+                <w:rFonts w:ascii="Arial" w:hAnsi="Arial" w:cs="Arial"/>
+                <w:sz w:val="20"/>
+                <w:szCs w:val="20"/>
+              </w:rPr>
+              <w:t xml:space="preserve"> </w:t>
+            </w:r>
+            <w:proofErr w:type="spellStart"/>
+            <w:r>
+              <w:rPr>
+                <w:rFonts w:ascii="Arial" w:hAnsi="Arial" w:cs="Arial"/>
+                <w:sz w:val="20"/>
+                <w:szCs w:val="20"/>
+              </w:rPr>
+              <w:t>ou</w:t>
+            </w:r>
+            <w:proofErr w:type="spellEnd"/>
+            <w:r>
+              <w:rPr>
+                <w:rFonts w:ascii="Arial" w:hAnsi="Arial" w:cs="Arial"/>
+                <w:sz w:val="20"/>
+                <w:szCs w:val="20"/>
+              </w:rPr>
+              <w:t xml:space="preserve"> </w:t>
+            </w:r>
+            <w:proofErr w:type="spellStart"/>
+            <w:r>
+              <w:rPr>
+                <w:rFonts w:ascii="Arial" w:hAnsi="Arial" w:cs="Arial"/>
+                <w:sz w:val="20"/>
+                <w:szCs w:val="20"/>
+              </w:rPr>
+              <w:t>culturais</w:t>
+            </w:r>
+            <w:proofErr w:type="spellEnd"/>
           </w:p>
         </w:tc>
         <w:tc>
@@ -803,7 +1071,27 @@
                 <w:szCs w:val="20"/>
                 <w:lang w:val="pt-BR"/>
               </w:rPr>
-              <w:t xml:space="preserve">Palestras, workshops, conferências, mesas-redondas etc, em que o discente seja </w:t>
+              <w:t xml:space="preserve">Palestras, workshops, conferências, mesas-redondas </w:t>
+            </w:r>
+            <w:proofErr w:type="spellStart"/>
+            <w:r>
+              <w:rPr>
+                <w:rFonts w:ascii="Arial" w:hAnsi="Arial" w:cs="Arial"/>
+                <w:sz w:val="20"/>
+                <w:szCs w:val="20"/>
+                <w:lang w:val="pt-BR"/>
+              </w:rPr>
+              <w:t>etc</w:t>
+            </w:r>
+            <w:proofErr w:type="spellEnd"/>
+            <w:r>
+              <w:rPr>
+                <w:rFonts w:ascii="Arial" w:hAnsi="Arial" w:cs="Arial"/>
+                <w:sz w:val="20"/>
+                <w:szCs w:val="20"/>
+                <w:lang w:val="pt-BR"/>
+              </w:rPr>
+              <w:t xml:space="preserve">, em que o discente seja </w:t>
             </w:r>
             <w:r>
               <w:rPr>
@@ -865,14 +1153,34 @@
                 <w:szCs w:val="20"/>
               </w:rPr>
             </w:pPr>
-            <w:r>
-              <w:rPr>
-                <w:rFonts w:ascii="Arial" w:hAnsi="Arial" w:cs="Arial"/>
-                <w:sz w:val="20"/>
-                <w:szCs w:val="20"/>
-              </w:rPr>
-              <w:t>Projetos Assistenciais</w:t>
-            </w:r>
+            <w:proofErr w:type="spellStart"/>
+            <w:r>
+              <w:rPr>
+                <w:rFonts w:ascii="Arial" w:hAnsi="Arial" w:cs="Arial"/>
+                <w:sz w:val="20"/>
+                <w:szCs w:val="20"/>
+              </w:rPr>
+              <w:t>Projetos</w:t>
+            </w:r>
+            <w:proofErr w:type="spellEnd"/>
+            <w:r>
+              <w:rPr>
+                <w:rFonts w:ascii="Arial" w:hAnsi="Arial" w:cs="Arial"/>
+                <w:sz w:val="20"/>
+                <w:szCs w:val="20"/>
+              </w:rPr>
+              <w:t xml:space="preserve"> </w:t>
+            </w:r>
+            <w:proofErr w:type="spellStart"/>
+            <w:r>
+              <w:rPr>
+                <w:rFonts w:ascii="Arial" w:hAnsi="Arial" w:cs="Arial"/>
+                <w:sz w:val="20"/>
+                <w:szCs w:val="20"/>
+              </w:rPr>
+              <w:t>Assistenciais</w:t>
+            </w:r>
+            <w:proofErr w:type="spellEnd"/>
           </w:p>
         </w:tc>
         <w:tc>
@@ -1190,8 +1498,19 @@
                 <w:szCs w:val="20"/>
                 <w:lang w:val="pt-BR" w:eastAsia="pt-BR"/>
               </w:rPr>
-              <w:t>Disciplinas extra-curriculares</w:t>
-            </w:r>
+              <w:t xml:space="preserve">Disciplinas </w:t>
+            </w:r>
+            <w:proofErr w:type="spellStart"/>
+            <w:r>
+              <w:rPr>
+                <w:rFonts w:ascii="Arial" w:hAnsi="Arial" w:cs="Arial"/>
+                <w:sz w:val="20"/>
+                <w:szCs w:val="20"/>
+                <w:lang w:val="pt-BR" w:eastAsia="pt-BR"/>
+              </w:rPr>
+              <w:t>extra-curriculares</w:t>
+            </w:r>
+            <w:proofErr w:type="spellEnd"/>
           </w:p>
         </w:tc>
         <w:tc>
@@ -1215,7 +1534,27 @@
                 <w:szCs w:val="20"/>
                 <w:lang w:val="pt-BR"/>
               </w:rPr>
-              <w:t>Realização e aprovação em disciplina de graduação extra-curricular do curso a partir do seu ingresso.</w:t>
+              <w:t xml:space="preserve">Realização e aprovação em disciplina de graduação </w:t>
+            </w:r>
+            <w:proofErr w:type="spellStart"/>
+            <w:r>
+              <w:rPr>
+                <w:rFonts w:ascii="Arial" w:hAnsi="Arial" w:cs="Arial"/>
+                <w:sz w:val="20"/>
+                <w:szCs w:val="20"/>
+                <w:lang w:val="pt-BR"/>
+              </w:rPr>
+              <w:t>extra-curricular</w:t>
+            </w:r>
+            <w:proofErr w:type="spellEnd"/>
+            <w:r>
+              <w:rPr>
+                <w:rFonts w:ascii="Arial" w:hAnsi="Arial" w:cs="Arial"/>
+                <w:sz w:val="20"/>
+                <w:szCs w:val="20"/>
+                <w:lang w:val="pt-BR"/>
+              </w:rPr>
+              <w:t xml:space="preserve"> do curso a partir do seu ingresso.</w:t>
             </w:r>
           </w:p>
         </w:tc>
@@ -1439,8 +1778,19 @@
           <w:szCs w:val="24"/>
           <w:lang w:val="pt-BR"/>
         </w:rPr>
-        <w:t>atestados, certificados, relatórios, pareceres etc</w:t>
-      </w:r>
+        <w:t xml:space="preserve">atestados, certificados, relatórios, pareceres </w:t>
+      </w:r>
+      <w:proofErr w:type="spellStart"/>
+      <w:r>
+        <w:rPr>
+          <w:rFonts w:ascii="Arial" w:hAnsi="Arial" w:cs="Arial"/>
+          <w:sz w:val="24"/>
+          <w:szCs w:val="24"/>
+          <w:lang w:val="pt-BR"/>
+        </w:rPr>
+        <w:t>etc</w:t>
+      </w:r>
+      <w:proofErr w:type="spellEnd"/>
       <w:r>
         <w:rPr>
           <w:rFonts w:ascii="Arial" w:hAnsi="Arial" w:cs="Arial"/>
@@ -1572,8 +1922,9 @@
           <w:szCs w:val="24"/>
           <w:lang w:val="pt-BR" w:eastAsia="pt-BR"/>
         </w:rPr>
-        <w:t xml:space="preserve">do  Uni-FACEF, uma via do atestado de conclusão das atividades </w:t>
-      </w:r>
+        <w:t xml:space="preserve">do  </w:t>
+      </w:r>
+      <w:proofErr w:type="spellStart"/>
       <w:r>
         <w:rPr>
           <w:rFonts w:ascii="Arial" w:hAnsi="Arial" w:cs="Arial"/>
@@ -1581,6 +1932,25 @@
           <w:szCs w:val="24"/>
           <w:lang w:val="pt-BR" w:eastAsia="pt-BR"/>
         </w:rPr>
+        <w:t>Uni-FACEF</w:t>
+      </w:r>
+      <w:proofErr w:type="spellEnd"/>
+      <w:r>
+        <w:rPr>
+          <w:rFonts w:ascii="Arial" w:hAnsi="Arial" w:cs="Arial"/>
+          <w:sz w:val="24"/>
+          <w:szCs w:val="24"/>
+          <w:lang w:val="pt-BR" w:eastAsia="pt-BR"/>
+        </w:rPr>
+        <w:t xml:space="preserve">, uma via do atestado de conclusão das atividades </w:t>
+      </w:r>
+      <w:r>
+        <w:rPr>
+          <w:rFonts w:ascii="Arial" w:hAnsi="Arial" w:cs="Arial"/>
+          <w:sz w:val="24"/>
+          <w:szCs w:val="24"/>
+          <w:lang w:val="pt-BR" w:eastAsia="pt-BR"/>
+        </w:rPr>
         <w:t>complementares</w:t>
       </w:r>
       <w:r>
@@ -1608,7 +1978,27 @@
           <w:szCs w:val="24"/>
           <w:lang w:val="pt-BR" w:eastAsia="pt-BR"/>
         </w:rPr>
-        <w:t xml:space="preserve">. Uma outra via do atestado de conclusão das atividades e o formulário de registro de atividades serão encaminhados à Secretaria do Uni-FACEF, sendo arquivados no Prontuário do discente. </w:t>
+        <w:t xml:space="preserve">. Uma outra via do atestado de conclusão das atividades e o formulário de registro de atividades serão encaminhados à Secretaria do </w:t>
+      </w:r>
+      <w:proofErr w:type="spellStart"/>
+      <w:r>
+        <w:rPr>
+          <w:rFonts w:ascii="Arial" w:hAnsi="Arial" w:cs="Arial"/>
+          <w:sz w:val="24"/>
+          <w:szCs w:val="24"/>
+          <w:lang w:val="pt-BR" w:eastAsia="pt-BR"/>
+        </w:rPr>
+        <w:t>Uni-FACEF</w:t>
+      </w:r>
+      <w:proofErr w:type="spellEnd"/>
+      <w:r>
+        <w:rPr>
+          <w:rFonts w:ascii="Arial" w:hAnsi="Arial" w:cs="Arial"/>
+          <w:sz w:val="24"/>
+          <w:szCs w:val="24"/>
+          <w:lang w:val="pt-BR" w:eastAsia="pt-BR"/>
+        </w:rPr>
+        <w:t xml:space="preserve">, sendo arquivados no Prontuário do discente. </w:t>
       </w:r>
     </w:p>
     <w:p>
@@ -1975,6 +2365,7 @@
                 <w:color w:val="4F81BD"/>
               </w:rPr>
             </w:pPr>
+            <w:proofErr w:type="spellStart"/>
             <w:r>
               <w:rPr>
                 <w:rFonts w:ascii="Arial" w:eastAsia="Times New Roman" w:hAnsi="Arial" w:cs="Arial"/>
@@ -1982,6 +2373,7 @@
               </w:rPr>
               <w:t>Atividade</w:t>
             </w:r>
+            <w:proofErr w:type="spellEnd"/>
           </w:p>
         </w:tc>
         <w:tc>
@@ -2003,52 +2395,82 @@
                 <w:b/>
                 <w:bCs/>
               </w:rPr>
-              <w:t>Data da realização</w:t>
-            </w:r>
-          </w:p>
-        </w:tc>
-        <w:tc>
-          <w:tcPr>
-            <w:tcW w:w="2755" w:type="dxa"/>
-          </w:tcPr>
-          <w:p>
-            <w:pPr>
-              <w:jc w:val="both"/>
+              <w:t xml:space="preserve">Data da </w:t>
+            </w:r>
+            <w:proofErr w:type="spellStart"/>
+            <w:r>
               <w:rPr>
                 <w:rFonts w:ascii="Arial" w:hAnsi="Arial" w:cs="Arial"/>
                 <w:b/>
                 <w:bCs/>
               </w:rPr>
-            </w:pPr>
-            <w:r>
+              <w:t>realização</w:t>
+            </w:r>
+            <w:proofErr w:type="spellEnd"/>
+          </w:p>
+        </w:tc>
+        <w:tc>
+          <w:tcPr>
+            <w:tcW w:w="2755" w:type="dxa"/>
+          </w:tcPr>
+          <w:p>
+            <w:pPr>
+              <w:jc w:val="both"/>
               <w:rPr>
                 <w:rFonts w:ascii="Arial" w:hAnsi="Arial" w:cs="Arial"/>
                 <w:b/>
                 <w:bCs/>
               </w:rPr>
-              <w:t>Documento Comprobatório</w:t>
-            </w:r>
-          </w:p>
-        </w:tc>
-        <w:tc>
-          <w:tcPr>
-            <w:tcW w:w="1562" w:type="dxa"/>
-          </w:tcPr>
-          <w:p>
-            <w:pPr>
-              <w:jc w:val="both"/>
+            </w:pPr>
+            <w:proofErr w:type="spellStart"/>
+            <w:r>
               <w:rPr>
                 <w:rFonts w:ascii="Arial" w:hAnsi="Arial" w:cs="Arial"/>
                 <w:b/>
                 <w:bCs/>
               </w:rPr>
-            </w:pPr>
+              <w:t>Documento</w:t>
+            </w:r>
+            <w:proofErr w:type="spellEnd"/>
             <w:r>
               <w:rPr>
                 <w:rFonts w:ascii="Arial" w:hAnsi="Arial" w:cs="Arial"/>
                 <w:b/>
                 <w:bCs/>
               </w:rPr>
+              <w:t xml:space="preserve"> </w:t>
+            </w:r>
+            <w:proofErr w:type="spellStart"/>
+            <w:r>
+              <w:rPr>
+                <w:rFonts w:ascii="Arial" w:hAnsi="Arial" w:cs="Arial"/>
+                <w:b/>
+                <w:bCs/>
+              </w:rPr>
+              <w:t>Comprobatório</w:t>
+            </w:r>
+            <w:proofErr w:type="spellEnd"/>
+          </w:p>
+        </w:tc>
+        <w:tc>
+          <w:tcPr>
+            <w:tcW w:w="1562" w:type="dxa"/>
+          </w:tcPr>
+          <w:p>
+            <w:pPr>
+              <w:jc w:val="both"/>
+              <w:rPr>
+                <w:rFonts w:ascii="Arial" w:hAnsi="Arial" w:cs="Arial"/>
+                <w:b/>
+                <w:bCs/>
+              </w:rPr>
+            </w:pPr>
+            <w:r>
+              <w:rPr>
+                <w:rFonts w:ascii="Arial" w:hAnsi="Arial" w:cs="Arial"/>
+                <w:b/>
+                <w:bCs/>
+              </w:rPr>
               <w:t>Total de Horas</w:t>
             </w:r>
           </w:p>
@@ -2065,6 +2487,7 @@
                 <w:color w:val="243F60"/>
               </w:rPr>
             </w:pPr>
+            <w:proofErr w:type="spellStart"/>
             <w:r>
               <w:rPr>
                 <w:rFonts w:ascii="Arial" w:hAnsi="Arial" w:cs="Arial"/>
@@ -2073,6 +2496,7 @@
               </w:rPr>
               <w:t>Semestre</w:t>
             </w:r>
+            <w:proofErr w:type="spellEnd"/>
           </w:p>
         </w:tc>
       </w:tr>
@@ -2092,12 +2516,28 @@
                 <w:rFonts w:ascii="Arial" w:hAnsi="Arial" w:cs="Arial"/>
               </w:rPr>
             </w:pPr>
-            <w:r>
-              <w:rPr>
-                <w:rFonts w:ascii="Arial" w:hAnsi="Arial" w:cs="Arial"/>
-              </w:rPr>
-              <w:t>Curso de Extensão</w:t>
-            </w:r>
+            <w:proofErr w:type="spellStart"/>
+            <w:r>
+              <w:rPr>
+                <w:rFonts w:ascii="Arial" w:hAnsi="Arial" w:cs="Arial"/>
+              </w:rPr>
+              <w:t>Curso</w:t>
+            </w:r>
+            <w:proofErr w:type="spellEnd"/>
+            <w:r>
+              <w:rPr>
+                <w:rFonts w:ascii="Arial" w:hAnsi="Arial" w:cs="Arial"/>
+              </w:rPr>
+              <w:t xml:space="preserve"> de </w:t>
+            </w:r>
+            <w:proofErr w:type="spellStart"/>
+            <w:r>
+              <w:rPr>
+                <w:rFonts w:ascii="Arial" w:hAnsi="Arial" w:cs="Arial"/>
+              </w:rPr>
+              <w:t>Extensão</w:t>
+            </w:r>
+            <w:proofErr w:type="spellEnd"/>
           </w:p>
         </w:tc>
         <w:tc>
@@ -2150,7 +2590,39 @@
                 <w:rFonts w:ascii="Arial" w:hAnsi="Arial" w:cs="Arial"/>
                 <w:highlight w:val="yellow"/>
               </w:rPr>
-              <w:t>No Anexo, enumere o certificado.</w:t>
+              <w:t xml:space="preserve">No Anexo, </w:t>
+            </w:r>
+            <w:proofErr w:type="spellStart"/>
+            <w:r>
+              <w:rPr>
+                <w:rFonts w:ascii="Arial" w:hAnsi="Arial" w:cs="Arial"/>
+                <w:highlight w:val="yellow"/>
+              </w:rPr>
+              <w:t>enumere</w:t>
+            </w:r>
+            <w:proofErr w:type="spellEnd"/>
+            <w:r>
+              <w:rPr>
+                <w:rFonts w:ascii="Arial" w:hAnsi="Arial" w:cs="Arial"/>
+                <w:highlight w:val="yellow"/>
+              </w:rPr>
+              <w:t xml:space="preserve"> o </w:t>
+            </w:r>
+            <w:proofErr w:type="spellStart"/>
+            <w:r>
+              <w:rPr>
+                <w:rFonts w:ascii="Arial" w:hAnsi="Arial" w:cs="Arial"/>
+                <w:highlight w:val="yellow"/>
+              </w:rPr>
+              <w:t>certificado</w:t>
+            </w:r>
+            <w:proofErr w:type="spellEnd"/>
+            <w:r>
+              <w:rPr>
+                <w:rFonts w:ascii="Arial" w:hAnsi="Arial" w:cs="Arial"/>
+                <w:highlight w:val="yellow"/>
+              </w:rPr>
+              <w:t>.</w:t>
             </w:r>
           </w:p>
         </w:tc>
@@ -2734,6 +3206,670 @@
                 <w:lang w:val="pt-BR"/>
               </w:rPr>
             </w:pPr>
+            <w:r>
+              <w:rPr>
+                <w:rFonts w:ascii="Arial" w:hAnsi="Arial" w:cs="Arial"/>
+                <w:lang w:val="pt-BR"/>
+              </w:rPr>
+              <w:t>VIII Semana de Computação</w:t>
+            </w:r>
+          </w:p>
+        </w:tc>
+        <w:tc>
+          <w:tcPr>
+            <w:tcW w:w="2270" w:type="dxa"/>
+          </w:tcPr>
+          <w:p>
+            <w:pPr>
+              <w:jc w:val="both"/>
+              <w:rPr>
+                <w:rFonts w:ascii="Arial" w:hAnsi="Arial" w:cs="Arial"/>
+                <w:lang w:val="pt-BR"/>
+              </w:rPr>
+            </w:pPr>
+            <w:r>
+              <w:rPr>
+                <w:rFonts w:ascii="Arial" w:hAnsi="Arial" w:cs="Arial"/>
+                <w:lang w:val="pt-BR"/>
+              </w:rPr>
+              <w:t>31/05/2017</w:t>
+            </w:r>
+          </w:p>
+        </w:tc>
+        <w:tc>
+          <w:tcPr>
+            <w:tcW w:w="2755" w:type="dxa"/>
+          </w:tcPr>
+          <w:p>
+            <w:pPr>
+              <w:jc w:val="both"/>
+              <w:rPr>
+                <w:rFonts w:ascii="Arial" w:hAnsi="Arial" w:cs="Arial"/>
+                <w:lang w:val="pt-BR"/>
+              </w:rPr>
+            </w:pPr>
+          </w:p>
+        </w:tc>
+        <w:tc>
+          <w:tcPr>
+            <w:tcW w:w="1562" w:type="dxa"/>
+          </w:tcPr>
+          <w:p>
+            <w:pPr>
+              <w:jc w:val="both"/>
+              <w:rPr>
+                <w:rFonts w:ascii="Arial" w:hAnsi="Arial" w:cs="Arial"/>
+                <w:lang w:val="pt-BR"/>
+              </w:rPr>
+            </w:pPr>
+            <w:r>
+              <w:rPr>
+                <w:rFonts w:ascii="Arial" w:hAnsi="Arial" w:cs="Arial"/>
+                <w:lang w:val="pt-BR"/>
+              </w:rPr>
+              <w:t>4 horas</w:t>
+            </w:r>
+          </w:p>
+        </w:tc>
+        <w:tc>
+          <w:tcPr>
+            <w:tcW w:w="1838" w:type="dxa"/>
+          </w:tcPr>
+          <w:p>
+            <w:pPr>
+              <w:jc w:val="both"/>
+              <w:rPr>
+                <w:rFonts w:ascii="Arial" w:hAnsi="Arial" w:cs="Arial"/>
+                <w:lang w:val="pt-BR"/>
+              </w:rPr>
+            </w:pPr>
+            <w:r>
+              <w:rPr>
+                <w:rFonts w:ascii="Arial" w:hAnsi="Arial" w:cs="Arial"/>
+                <w:lang w:val="pt-BR"/>
+              </w:rPr>
+              <w:t>1º Semestre</w:t>
+            </w:r>
+          </w:p>
+        </w:tc>
+      </w:tr>
+      <w:tr>
+        <w:trPr>
+          <w:trHeight w:val="483"/>
+        </w:trPr>
+        <w:tc>
+          <w:tcPr>
+            <w:tcW w:w="6344" w:type="dxa"/>
+          </w:tcPr>
+          <w:p>
+            <w:pPr>
+              <w:spacing w:line="300" w:lineRule="atLeast"/>
+              <w:jc w:val="both"/>
+              <w:rPr>
+                <w:rFonts w:ascii="Arial" w:hAnsi="Arial" w:cs="Arial"/>
+                <w:lang w:val="pt-BR"/>
+              </w:rPr>
+            </w:pPr>
+            <w:r>
+              <w:rPr>
+                <w:rFonts w:ascii="Arial" w:hAnsi="Arial" w:cs="Arial"/>
+                <w:lang w:val="pt-BR"/>
+              </w:rPr>
+              <w:t>Trote Solidário</w:t>
+            </w:r>
+          </w:p>
+        </w:tc>
+        <w:tc>
+          <w:tcPr>
+            <w:tcW w:w="2270" w:type="dxa"/>
+          </w:tcPr>
+          <w:p>
+            <w:pPr>
+              <w:jc w:val="both"/>
+              <w:rPr>
+                <w:rFonts w:ascii="Arial" w:hAnsi="Arial" w:cs="Arial"/>
+                <w:lang w:val="pt-BR"/>
+              </w:rPr>
+            </w:pPr>
+            <w:r>
+              <w:rPr>
+                <w:rFonts w:ascii="Arial" w:hAnsi="Arial" w:cs="Arial"/>
+                <w:lang w:val="pt-BR"/>
+              </w:rPr>
+              <w:t>24/03/2017</w:t>
+            </w:r>
+          </w:p>
+        </w:tc>
+        <w:tc>
+          <w:tcPr>
+            <w:tcW w:w="2755" w:type="dxa"/>
+          </w:tcPr>
+          <w:p>
+            <w:pPr>
+              <w:jc w:val="both"/>
+              <w:rPr>
+                <w:rFonts w:ascii="Arial" w:hAnsi="Arial" w:cs="Arial"/>
+                <w:lang w:val="pt-BR"/>
+              </w:rPr>
+            </w:pPr>
+          </w:p>
+        </w:tc>
+        <w:tc>
+          <w:tcPr>
+            <w:tcW w:w="1562" w:type="dxa"/>
+          </w:tcPr>
+          <w:p>
+            <w:pPr>
+              <w:jc w:val="both"/>
+              <w:rPr>
+                <w:rFonts w:ascii="Arial" w:hAnsi="Arial" w:cs="Arial"/>
+                <w:lang w:val="pt-BR"/>
+              </w:rPr>
+            </w:pPr>
+            <w:r>
+              <w:rPr>
+                <w:rFonts w:ascii="Arial" w:hAnsi="Arial" w:cs="Arial"/>
+                <w:lang w:val="pt-BR"/>
+              </w:rPr>
+              <w:t>40 horas</w:t>
+            </w:r>
+          </w:p>
+        </w:tc>
+        <w:tc>
+          <w:tcPr>
+            <w:tcW w:w="1838" w:type="dxa"/>
+          </w:tcPr>
+          <w:p>
+            <w:pPr>
+              <w:jc w:val="both"/>
+              <w:rPr>
+                <w:rFonts w:ascii="Arial" w:hAnsi="Arial" w:cs="Arial"/>
+                <w:lang w:val="pt-BR"/>
+              </w:rPr>
+            </w:pPr>
+            <w:r>
+              <w:rPr>
+                <w:rFonts w:ascii="Arial" w:hAnsi="Arial" w:cs="Arial"/>
+                <w:lang w:val="pt-BR"/>
+              </w:rPr>
+              <w:t>1º Semestre</w:t>
+            </w:r>
+          </w:p>
+        </w:tc>
+      </w:tr>
+      <w:tr>
+        <w:trPr>
+          <w:trHeight w:val="483"/>
+        </w:trPr>
+        <w:tc>
+          <w:tcPr>
+            <w:tcW w:w="6344" w:type="dxa"/>
+          </w:tcPr>
+          <w:p>
+            <w:pPr>
+              <w:spacing w:line="300" w:lineRule="atLeast"/>
+              <w:jc w:val="both"/>
+              <w:rPr>
+                <w:rFonts w:ascii="Arial" w:hAnsi="Arial" w:cs="Arial"/>
+                <w:lang w:val="pt-BR"/>
+              </w:rPr>
+            </w:pPr>
+          </w:p>
+        </w:tc>
+        <w:tc>
+          <w:tcPr>
+            <w:tcW w:w="2270" w:type="dxa"/>
+          </w:tcPr>
+          <w:p>
+            <w:pPr>
+              <w:jc w:val="both"/>
+              <w:rPr>
+                <w:rFonts w:ascii="Arial" w:hAnsi="Arial" w:cs="Arial"/>
+                <w:lang w:val="pt-BR"/>
+              </w:rPr>
+            </w:pPr>
+          </w:p>
+        </w:tc>
+        <w:tc>
+          <w:tcPr>
+            <w:tcW w:w="2755" w:type="dxa"/>
+          </w:tcPr>
+          <w:p>
+            <w:pPr>
+              <w:jc w:val="both"/>
+              <w:rPr>
+                <w:rFonts w:ascii="Arial" w:hAnsi="Arial" w:cs="Arial"/>
+                <w:lang w:val="pt-BR"/>
+              </w:rPr>
+            </w:pPr>
+          </w:p>
+        </w:tc>
+        <w:tc>
+          <w:tcPr>
+            <w:tcW w:w="1562" w:type="dxa"/>
+          </w:tcPr>
+          <w:p>
+            <w:pPr>
+              <w:jc w:val="both"/>
+              <w:rPr>
+                <w:rFonts w:ascii="Arial" w:hAnsi="Arial" w:cs="Arial"/>
+                <w:lang w:val="pt-BR"/>
+              </w:rPr>
+            </w:pPr>
+          </w:p>
+        </w:tc>
+        <w:tc>
+          <w:tcPr>
+            <w:tcW w:w="1838" w:type="dxa"/>
+          </w:tcPr>
+          <w:p>
+            <w:pPr>
+              <w:jc w:val="both"/>
+              <w:rPr>
+                <w:rFonts w:ascii="Arial" w:hAnsi="Arial" w:cs="Arial"/>
+                <w:lang w:val="pt-BR"/>
+              </w:rPr>
+            </w:pPr>
+          </w:p>
+        </w:tc>
+      </w:tr>
+      <w:tr>
+        <w:trPr>
+          <w:trHeight w:val="483"/>
+        </w:trPr>
+        <w:tc>
+          <w:tcPr>
+            <w:tcW w:w="6344" w:type="dxa"/>
+          </w:tcPr>
+          <w:p>
+            <w:pPr>
+              <w:spacing w:line="300" w:lineRule="atLeast"/>
+              <w:jc w:val="both"/>
+              <w:rPr>
+                <w:rFonts w:ascii="Arial" w:hAnsi="Arial" w:cs="Arial"/>
+                <w:lang w:val="pt-BR"/>
+              </w:rPr>
+            </w:pPr>
+          </w:p>
+        </w:tc>
+        <w:tc>
+          <w:tcPr>
+            <w:tcW w:w="2270" w:type="dxa"/>
+          </w:tcPr>
+          <w:p>
+            <w:pPr>
+              <w:jc w:val="both"/>
+              <w:rPr>
+                <w:rFonts w:ascii="Arial" w:hAnsi="Arial" w:cs="Arial"/>
+                <w:lang w:val="pt-BR"/>
+              </w:rPr>
+            </w:pPr>
+          </w:p>
+        </w:tc>
+        <w:tc>
+          <w:tcPr>
+            <w:tcW w:w="2755" w:type="dxa"/>
+          </w:tcPr>
+          <w:p>
+            <w:pPr>
+              <w:jc w:val="both"/>
+              <w:rPr>
+                <w:rFonts w:ascii="Arial" w:hAnsi="Arial" w:cs="Arial"/>
+                <w:lang w:val="pt-BR"/>
+              </w:rPr>
+            </w:pPr>
+          </w:p>
+        </w:tc>
+        <w:tc>
+          <w:tcPr>
+            <w:tcW w:w="1562" w:type="dxa"/>
+          </w:tcPr>
+          <w:p>
+            <w:pPr>
+              <w:jc w:val="both"/>
+              <w:rPr>
+                <w:rFonts w:ascii="Arial" w:hAnsi="Arial" w:cs="Arial"/>
+                <w:lang w:val="pt-BR"/>
+              </w:rPr>
+            </w:pPr>
+          </w:p>
+        </w:tc>
+        <w:tc>
+          <w:tcPr>
+            <w:tcW w:w="1838" w:type="dxa"/>
+          </w:tcPr>
+          <w:p>
+            <w:pPr>
+              <w:jc w:val="both"/>
+              <w:rPr>
+                <w:rFonts w:ascii="Arial" w:hAnsi="Arial" w:cs="Arial"/>
+                <w:lang w:val="pt-BR"/>
+              </w:rPr>
+            </w:pPr>
+          </w:p>
+        </w:tc>
+      </w:tr>
+      <w:tr>
+        <w:trPr>
+          <w:trHeight w:val="483"/>
+        </w:trPr>
+        <w:tc>
+          <w:tcPr>
+            <w:tcW w:w="6344" w:type="dxa"/>
+          </w:tcPr>
+          <w:p>
+            <w:pPr>
+              <w:spacing w:line="300" w:lineRule="atLeast"/>
+              <w:jc w:val="both"/>
+              <w:rPr>
+                <w:rFonts w:ascii="Arial" w:hAnsi="Arial" w:cs="Arial"/>
+                <w:lang w:val="pt-BR"/>
+              </w:rPr>
+            </w:pPr>
+          </w:p>
+        </w:tc>
+        <w:tc>
+          <w:tcPr>
+            <w:tcW w:w="2270" w:type="dxa"/>
+          </w:tcPr>
+          <w:p>
+            <w:pPr>
+              <w:jc w:val="both"/>
+              <w:rPr>
+                <w:rFonts w:ascii="Arial" w:hAnsi="Arial" w:cs="Arial"/>
+                <w:lang w:val="pt-BR"/>
+              </w:rPr>
+            </w:pPr>
+          </w:p>
+        </w:tc>
+        <w:tc>
+          <w:tcPr>
+            <w:tcW w:w="2755" w:type="dxa"/>
+          </w:tcPr>
+          <w:p>
+            <w:pPr>
+              <w:jc w:val="both"/>
+              <w:rPr>
+                <w:rFonts w:ascii="Arial" w:hAnsi="Arial" w:cs="Arial"/>
+                <w:lang w:val="pt-BR"/>
+              </w:rPr>
+            </w:pPr>
+          </w:p>
+        </w:tc>
+        <w:tc>
+          <w:tcPr>
+            <w:tcW w:w="1562" w:type="dxa"/>
+          </w:tcPr>
+          <w:p>
+            <w:pPr>
+              <w:jc w:val="both"/>
+              <w:rPr>
+                <w:rFonts w:ascii="Arial" w:hAnsi="Arial" w:cs="Arial"/>
+                <w:lang w:val="pt-BR"/>
+              </w:rPr>
+            </w:pPr>
+          </w:p>
+        </w:tc>
+        <w:tc>
+          <w:tcPr>
+            <w:tcW w:w="1838" w:type="dxa"/>
+          </w:tcPr>
+          <w:p>
+            <w:pPr>
+              <w:jc w:val="both"/>
+              <w:rPr>
+                <w:rFonts w:ascii="Arial" w:hAnsi="Arial" w:cs="Arial"/>
+                <w:lang w:val="pt-BR"/>
+              </w:rPr>
+            </w:pPr>
+          </w:p>
+        </w:tc>
+      </w:tr>
+      <w:tr>
+        <w:trPr>
+          <w:trHeight w:val="483"/>
+        </w:trPr>
+        <w:tc>
+          <w:tcPr>
+            <w:tcW w:w="6344" w:type="dxa"/>
+          </w:tcPr>
+          <w:p>
+            <w:pPr>
+              <w:spacing w:line="300" w:lineRule="atLeast"/>
+              <w:jc w:val="both"/>
+              <w:rPr>
+                <w:rFonts w:ascii="Arial" w:hAnsi="Arial" w:cs="Arial"/>
+                <w:lang w:val="pt-BR"/>
+              </w:rPr>
+            </w:pPr>
+          </w:p>
+        </w:tc>
+        <w:tc>
+          <w:tcPr>
+            <w:tcW w:w="2270" w:type="dxa"/>
+          </w:tcPr>
+          <w:p>
+            <w:pPr>
+              <w:jc w:val="both"/>
+              <w:rPr>
+                <w:rFonts w:ascii="Arial" w:hAnsi="Arial" w:cs="Arial"/>
+                <w:lang w:val="pt-BR"/>
+              </w:rPr>
+            </w:pPr>
+          </w:p>
+        </w:tc>
+        <w:tc>
+          <w:tcPr>
+            <w:tcW w:w="2755" w:type="dxa"/>
+          </w:tcPr>
+          <w:p>
+            <w:pPr>
+              <w:jc w:val="both"/>
+              <w:rPr>
+                <w:rFonts w:ascii="Arial" w:hAnsi="Arial" w:cs="Arial"/>
+                <w:lang w:val="pt-BR"/>
+              </w:rPr>
+            </w:pPr>
+          </w:p>
+        </w:tc>
+        <w:tc>
+          <w:tcPr>
+            <w:tcW w:w="1562" w:type="dxa"/>
+          </w:tcPr>
+          <w:p>
+            <w:pPr>
+              <w:jc w:val="both"/>
+              <w:rPr>
+                <w:rFonts w:ascii="Arial" w:hAnsi="Arial" w:cs="Arial"/>
+                <w:lang w:val="pt-BR"/>
+              </w:rPr>
+            </w:pPr>
+          </w:p>
+        </w:tc>
+        <w:tc>
+          <w:tcPr>
+            <w:tcW w:w="1838" w:type="dxa"/>
+          </w:tcPr>
+          <w:p>
+            <w:pPr>
+              <w:jc w:val="both"/>
+              <w:rPr>
+                <w:rFonts w:ascii="Arial" w:hAnsi="Arial" w:cs="Arial"/>
+                <w:lang w:val="pt-BR"/>
+              </w:rPr>
+            </w:pPr>
+          </w:p>
+        </w:tc>
+      </w:tr>
+      <w:tr>
+        <w:trPr>
+          <w:trHeight w:val="483"/>
+        </w:trPr>
+        <w:tc>
+          <w:tcPr>
+            <w:tcW w:w="6344" w:type="dxa"/>
+          </w:tcPr>
+          <w:p>
+            <w:pPr>
+              <w:spacing w:line="300" w:lineRule="atLeast"/>
+              <w:jc w:val="both"/>
+              <w:rPr>
+                <w:rFonts w:ascii="Arial" w:hAnsi="Arial" w:cs="Arial"/>
+                <w:lang w:val="pt-BR"/>
+              </w:rPr>
+            </w:pPr>
+          </w:p>
+        </w:tc>
+        <w:tc>
+          <w:tcPr>
+            <w:tcW w:w="2270" w:type="dxa"/>
+          </w:tcPr>
+          <w:p>
+            <w:pPr>
+              <w:jc w:val="both"/>
+              <w:rPr>
+                <w:rFonts w:ascii="Arial" w:hAnsi="Arial" w:cs="Arial"/>
+                <w:lang w:val="pt-BR"/>
+              </w:rPr>
+            </w:pPr>
+          </w:p>
+        </w:tc>
+        <w:tc>
+          <w:tcPr>
+            <w:tcW w:w="2755" w:type="dxa"/>
+          </w:tcPr>
+          <w:p>
+            <w:pPr>
+              <w:jc w:val="both"/>
+              <w:rPr>
+                <w:rFonts w:ascii="Arial" w:hAnsi="Arial" w:cs="Arial"/>
+                <w:lang w:val="pt-BR"/>
+              </w:rPr>
+            </w:pPr>
+          </w:p>
+        </w:tc>
+        <w:tc>
+          <w:tcPr>
+            <w:tcW w:w="1562" w:type="dxa"/>
+          </w:tcPr>
+          <w:p>
+            <w:pPr>
+              <w:jc w:val="both"/>
+              <w:rPr>
+                <w:rFonts w:ascii="Arial" w:hAnsi="Arial" w:cs="Arial"/>
+                <w:lang w:val="pt-BR"/>
+              </w:rPr>
+            </w:pPr>
+          </w:p>
+        </w:tc>
+        <w:tc>
+          <w:tcPr>
+            <w:tcW w:w="1838" w:type="dxa"/>
+          </w:tcPr>
+          <w:p>
+            <w:pPr>
+              <w:jc w:val="both"/>
+              <w:rPr>
+                <w:rFonts w:ascii="Arial" w:hAnsi="Arial" w:cs="Arial"/>
+                <w:lang w:val="pt-BR"/>
+              </w:rPr>
+            </w:pPr>
+          </w:p>
+        </w:tc>
+      </w:tr>
+      <w:tr>
+        <w:trPr>
+          <w:trHeight w:val="483"/>
+        </w:trPr>
+        <w:tc>
+          <w:tcPr>
+            <w:tcW w:w="6344" w:type="dxa"/>
+          </w:tcPr>
+          <w:p>
+            <w:pPr>
+              <w:spacing w:line="300" w:lineRule="atLeast"/>
+              <w:jc w:val="both"/>
+              <w:rPr>
+                <w:rFonts w:ascii="Arial" w:hAnsi="Arial" w:cs="Arial"/>
+                <w:lang w:val="pt-BR"/>
+              </w:rPr>
+            </w:pPr>
+          </w:p>
+        </w:tc>
+        <w:tc>
+          <w:tcPr>
+            <w:tcW w:w="2270" w:type="dxa"/>
+          </w:tcPr>
+          <w:p>
+            <w:pPr>
+              <w:jc w:val="both"/>
+              <w:rPr>
+                <w:rFonts w:ascii="Arial" w:hAnsi="Arial" w:cs="Arial"/>
+                <w:lang w:val="pt-BR"/>
+              </w:rPr>
+            </w:pPr>
+          </w:p>
+        </w:tc>
+        <w:tc>
+          <w:tcPr>
+            <w:tcW w:w="2755" w:type="dxa"/>
+          </w:tcPr>
+          <w:p>
+            <w:pPr>
+              <w:jc w:val="both"/>
+              <w:rPr>
+                <w:rFonts w:ascii="Arial" w:hAnsi="Arial" w:cs="Arial"/>
+                <w:lang w:val="pt-BR"/>
+              </w:rPr>
+            </w:pPr>
+          </w:p>
+        </w:tc>
+        <w:tc>
+          <w:tcPr>
+            <w:tcW w:w="1562" w:type="dxa"/>
+          </w:tcPr>
+          <w:p>
+            <w:pPr>
+              <w:jc w:val="both"/>
+              <w:rPr>
+                <w:rFonts w:ascii="Arial" w:hAnsi="Arial" w:cs="Arial"/>
+                <w:lang w:val="pt-BR"/>
+              </w:rPr>
+            </w:pPr>
+          </w:p>
+        </w:tc>
+        <w:tc>
+          <w:tcPr>
+            <w:tcW w:w="1838" w:type="dxa"/>
+          </w:tcPr>
+          <w:p>
+            <w:pPr>
+              <w:jc w:val="both"/>
+              <w:rPr>
+                <w:rFonts w:ascii="Arial" w:hAnsi="Arial" w:cs="Arial"/>
+                <w:lang w:val="pt-BR"/>
+              </w:rPr>
+            </w:pPr>
+          </w:p>
+        </w:tc>
+      </w:tr>
+      <w:tr>
+        <w:trPr>
+          <w:trHeight w:val="483"/>
+        </w:trPr>
+        <w:tc>
+          <w:tcPr>
+            <w:tcW w:w="6344" w:type="dxa"/>
+          </w:tcPr>
+          <w:p>
+            <w:pPr>
+              <w:spacing w:line="300" w:lineRule="atLeast"/>
+              <w:jc w:val="both"/>
+              <w:rPr>
+                <w:rFonts w:ascii="Arial" w:hAnsi="Arial" w:cs="Arial"/>
+                <w:lang w:val="pt-BR"/>
+              </w:rPr>
+            </w:pPr>
           </w:p>
         </w:tc>
         <w:tc>
@@ -2824,7 +3960,23 @@
           <w:rFonts w:ascii="Arial" w:hAnsi="Arial" w:cs="Arial"/>
           <w:lang w:val="pt-BR"/>
         </w:rPr>
-        <w:t>Franca, _____ de _________________ de ________.        _____________________     ____________________________</w:t>
+        <w:t xml:space="preserve">Franca, _____ de _________________ </w:t>
+      </w:r>
+      <w:proofErr w:type="spellStart"/>
+      <w:r>
+        <w:rPr>
+          <w:rFonts w:ascii="Arial" w:hAnsi="Arial" w:cs="Arial"/>
+          <w:lang w:val="pt-BR"/>
+        </w:rPr>
+        <w:t>de</w:t>
+      </w:r>
+      <w:proofErr w:type="spellEnd"/>
+      <w:r>
+        <w:rPr>
+          <w:rFonts w:ascii="Arial" w:hAnsi="Arial" w:cs="Arial"/>
+          <w:lang w:val="pt-BR"/>
+        </w:rPr>
+        <w:t xml:space="preserve"> ________.        _____________________     ____________________________</w:t>
       </w:r>
     </w:p>
     <w:p>
@@ -2999,6 +4151,7 @@
         </w:rPr>
         <w:t xml:space="preserve">do </w:t>
       </w:r>
+      <w:proofErr w:type="spellStart"/>
       <w:r>
         <w:rPr>
           <w:rFonts w:ascii="Arial" w:hAnsi="Arial" w:cs="Arial"/>
@@ -3006,14 +4159,122 @@
           <w:iCs/>
           <w:lang w:val="pt-BR"/>
         </w:rPr>
-        <w:t>Uni-FACEF Centro Universitário de Franca</w:t>
-      </w:r>
-      <w:r>
-        <w:rPr>
-          <w:rFonts w:ascii="Arial" w:hAnsi="Arial" w:cs="Arial"/>
-          <w:lang w:val="pt-BR"/>
-        </w:rPr>
-        <w:t>, atesta, para efeitos legais e pedagógicos, que o(a) aluno(a) ________________________________________  Código ____________, RG _________________, matriculado(a) no ________ semestre, turno ____________, no ano de _________, concluiu a carga horária de ________ horas, referentes às atividades complementares do Curso de Sistemas de Informação.</w:t>
+        <w:t>Uni-FACEF</w:t>
+      </w:r>
+      <w:proofErr w:type="spellEnd"/>
+      <w:r>
+        <w:rPr>
+          <w:rFonts w:ascii="Arial" w:hAnsi="Arial" w:cs="Arial"/>
+          <w:i/>
+          <w:iCs/>
+          <w:lang w:val="pt-BR"/>
+        </w:rPr>
+        <w:t xml:space="preserve"> Centro Universitário de Franca</w:t>
+      </w:r>
+      <w:r>
+        <w:rPr>
+          <w:rFonts w:ascii="Arial" w:hAnsi="Arial" w:cs="Arial"/>
+          <w:lang w:val="pt-BR"/>
+        </w:rPr>
+        <w:t xml:space="preserve">, atesta, para efeitos legais e pedagógicos, que o(a) aluno(a) </w:t>
+      </w:r>
+      <w:r>
+        <w:rPr>
+          <w:rFonts w:ascii="Arial" w:hAnsi="Arial" w:cs="Arial"/>
+          <w:lang w:val="pt-BR"/>
+        </w:rPr>
+        <w:t>Tarcísio José Martins Ribeiro</w:t>
+      </w:r>
+      <w:r>
+        <w:rPr>
+          <w:rFonts w:ascii="Arial" w:hAnsi="Arial" w:cs="Arial"/>
+          <w:lang w:val="pt-BR"/>
+        </w:rPr>
+        <w:t xml:space="preserve">  Código </w:t>
+      </w:r>
+      <w:r>
+        <w:rPr>
+          <w:rFonts w:ascii="Arial" w:hAnsi="Arial" w:cs="Arial"/>
+          <w:lang w:val="pt-BR"/>
+        </w:rPr>
+        <w:t>20382</w:t>
+      </w:r>
+      <w:r>
+        <w:rPr>
+          <w:rFonts w:ascii="Arial" w:hAnsi="Arial" w:cs="Arial"/>
+          <w:lang w:val="pt-BR"/>
+        </w:rPr>
+        <w:t xml:space="preserve">, RG </w:t>
+      </w:r>
+      <w:r>
+        <w:rPr>
+          <w:rFonts w:ascii="Arial" w:hAnsi="Arial" w:cs="Arial"/>
+          <w:lang w:val="pt-BR"/>
+        </w:rPr>
+        <w:t>20262161</w:t>
+      </w:r>
+      <w:r>
+        <w:rPr>
+          <w:rFonts w:ascii="Arial" w:hAnsi="Arial" w:cs="Arial"/>
+          <w:lang w:val="pt-BR"/>
+        </w:rPr>
+        <w:t xml:space="preserve">, matriculado(a) no </w:t>
+      </w:r>
+      <w:r>
+        <w:rPr>
+          <w:rFonts w:ascii="Arial" w:hAnsi="Arial" w:cs="Arial"/>
+          <w:lang w:val="pt-BR"/>
+        </w:rPr>
+        <w:t>8º</w:t>
+      </w:r>
+      <w:r>
+        <w:rPr>
+          <w:rFonts w:ascii="Arial" w:hAnsi="Arial" w:cs="Arial"/>
+          <w:lang w:val="pt-BR"/>
+        </w:rPr>
+        <w:t xml:space="preserve"> semestre, turno </w:t>
+      </w:r>
+      <w:r>
+        <w:rPr>
+          <w:rFonts w:ascii="Arial" w:hAnsi="Arial" w:cs="Arial"/>
+          <w:lang w:val="pt-BR"/>
+        </w:rPr>
+        <w:t>noturno</w:t>
+      </w:r>
+      <w:r>
+        <w:rPr>
+          <w:rFonts w:ascii="Arial" w:hAnsi="Arial" w:cs="Arial"/>
+          <w:lang w:val="pt-BR"/>
+        </w:rPr>
+        <w:t xml:space="preserve">, no ano de </w:t>
+      </w:r>
+      <w:r>
+        <w:rPr>
+          <w:rFonts w:ascii="Arial" w:hAnsi="Arial" w:cs="Arial"/>
+          <w:lang w:val="pt-BR"/>
+        </w:rPr>
+        <w:t>2022</w:t>
+      </w:r>
+      <w:r>
+        <w:rPr>
+          <w:rFonts w:ascii="Arial" w:hAnsi="Arial" w:cs="Arial"/>
+          <w:lang w:val="pt-BR"/>
+        </w:rPr>
+        <w:t xml:space="preserve">, concluiu a carga horária de </w:t>
+      </w:r>
+      <w:r>
+        <w:rPr>
+          <w:rFonts w:ascii="Arial" w:hAnsi="Arial" w:cs="Arial"/>
+          <w:lang w:val="pt-BR"/>
+        </w:rPr>
+        <w:t>140</w:t>
+      </w:r>
+      <w:r>
+        <w:rPr>
+          <w:rFonts w:ascii="Arial" w:hAnsi="Arial" w:cs="Arial"/>
+          <w:lang w:val="pt-BR"/>
+        </w:rPr>
+        <w:t xml:space="preserve"> horas, referentes às atividades complementares do Curso de Sistemas de Informação.</w:t>
       </w:r>
     </w:p>
     <w:p>
@@ -3031,7 +4292,23 @@
           <w:rFonts w:ascii="Arial" w:hAnsi="Arial" w:cs="Arial"/>
           <w:lang w:val="pt-BR"/>
         </w:rPr>
-        <w:t>Franca, ______ de ____________________ de ______.</w:t>
+        <w:t xml:space="preserve">Franca, ______ de ____________________ </w:t>
+      </w:r>
+      <w:proofErr w:type="spellStart"/>
+      <w:r>
+        <w:rPr>
+          <w:rFonts w:ascii="Arial" w:hAnsi="Arial" w:cs="Arial"/>
+          <w:lang w:val="pt-BR"/>
+        </w:rPr>
+        <w:t>de</w:t>
+      </w:r>
+      <w:proofErr w:type="spellEnd"/>
+      <w:r>
+        <w:rPr>
+          <w:rFonts w:ascii="Arial" w:hAnsi="Arial" w:cs="Arial"/>
+          <w:lang w:val="pt-BR"/>
+        </w:rPr>
+        <w:t xml:space="preserve"> ______.</w:t>
       </w:r>
     </w:p>
     <w:p>
@@ -3131,6 +4408,7 @@
         </w:rPr>
         <w:t xml:space="preserve">do </w:t>
       </w:r>
+      <w:proofErr w:type="spellStart"/>
       <w:r>
         <w:rPr>
           <w:rFonts w:ascii="Arial" w:hAnsi="Arial" w:cs="Arial"/>
@@ -3138,7 +4416,17 @@
           <w:iCs/>
           <w:lang w:val="pt-BR"/>
         </w:rPr>
-        <w:t>Uni-FACEF Centro Universitário de Franca</w:t>
+        <w:t>Uni-FACEF</w:t>
+      </w:r>
+      <w:proofErr w:type="spellEnd"/>
+      <w:r>
+        <w:rPr>
+          <w:rFonts w:ascii="Arial" w:hAnsi="Arial" w:cs="Arial"/>
+          <w:i/>
+          <w:iCs/>
+          <w:lang w:val="pt-BR"/>
+        </w:rPr>
+        <w:t xml:space="preserve"> Centro Universitário de Franca</w:t>
       </w:r>
       <w:r>
         <w:rPr>
@@ -3163,7 +4451,23 @@
           <w:rFonts w:ascii="Arial" w:hAnsi="Arial" w:cs="Arial"/>
           <w:lang w:val="pt-BR"/>
         </w:rPr>
-        <w:t>Franca, ______ de ____________________ de ______.</w:t>
+        <w:t xml:space="preserve">Franca, ______ de ____________________ </w:t>
+      </w:r>
+      <w:proofErr w:type="spellStart"/>
+      <w:r>
+        <w:rPr>
+          <w:rFonts w:ascii="Arial" w:hAnsi="Arial" w:cs="Arial"/>
+          <w:lang w:val="pt-BR"/>
+        </w:rPr>
+        <w:t>de</w:t>
+      </w:r>
+      <w:proofErr w:type="spellEnd"/>
+      <w:r>
+        <w:rPr>
+          <w:rFonts w:ascii="Arial" w:hAnsi="Arial" w:cs="Arial"/>
+          <w:lang w:val="pt-BR"/>
+        </w:rPr>
+        <w:t xml:space="preserve"> ______.</w:t>
       </w:r>
     </w:p>
     <w:p>
@@ -3243,7 +4547,6 @@
         <w:docPartUnique/>
       </w:docPartObj>
     </w:sdtPr>
-    <w:sdtEndPr/>
     <w:sdtContent>
       <w:p>
         <w:pPr>
@@ -3304,7 +4607,29 @@
         <w:szCs w:val="20"/>
         <w:lang w:val="pt-BR"/>
       </w:rPr>
-      <w:t>Av. Major Nicácio, 2433 – Bairro São José – CEP 14401-135 – Franca/SP – Fone/Fax: (16) 3713-4688</w:t>
+      <w:t xml:space="preserve">Av. Major </w:t>
+    </w:r>
+    <w:proofErr w:type="spellStart"/>
+    <w:r>
+      <w:rPr>
+        <w:rFonts w:cs="Arial"/>
+        <w:color w:val="333399"/>
+        <w:sz w:val="20"/>
+        <w:szCs w:val="20"/>
+        <w:lang w:val="pt-BR"/>
+      </w:rPr>
+      <w:t>Nicácio</w:t>
+    </w:r>
+    <w:proofErr w:type="spellEnd"/>
+    <w:r>
+      <w:rPr>
+        <w:rFonts w:cs="Arial"/>
+        <w:color w:val="333399"/>
+        <w:sz w:val="20"/>
+        <w:szCs w:val="20"/>
+        <w:lang w:val="pt-BR"/>
+      </w:rPr>
+      <w:t>, 2433 – Bairro São José – CEP 14401-135 – Franca/SP – Fone/Fax: (16) 3713-4688</w:t>
     </w:r>
     <w:r>
       <w:rPr>
@@ -3379,7 +4704,7 @@
       <w:rPr>
         <w:noProof/>
       </w:rPr>
-      <w:object w:dxaOrig="2760" w:dyaOrig="613" w14:anchorId="5DA45875">
+      <w:object w:dxaOrig="2760" w:dyaOrig="612" w14:anchorId="5DA45875">
         <v:shapetype id="_x0000_t75" coordsize="21600,21600" o:spt="75" o:preferrelative="t" path="m@4@5l@4@11@9@11@9@5xe" filled="f" stroked="f">
           <v:stroke joinstyle="miter"/>
           <v:formulas>
@@ -3399,10 +4724,10 @@
           <v:path o:extrusionok="f" gradientshapeok="t" o:connecttype="rect"/>
           <o:lock v:ext="edit" aspectratio="t"/>
         </v:shapetype>
-        <v:shape id="_x0000_i1025" type="#_x0000_t75" alt="" style="width:138pt;height:30.6pt;mso-width-percent:0;mso-height-percent:0;mso-width-percent:0;mso-height-percent:0">
+        <v:shape id="_x0000_i1025" type="#_x0000_t75" alt="" style="width:138pt;height:30.75pt;mso-width-percent:0;mso-height-percent:0;mso-width-percent:0;mso-height-percent:0">
           <v:imagedata r:id="rId1" o:title=""/>
         </v:shape>
-        <o:OLEObject Type="Embed" ProgID="CorelDRAW.Graphic.11" ShapeID="_x0000_i1025" DrawAspect="Content" ObjectID="_1715527199" r:id="rId2"/>
+        <o:OLEObject Type="Embed" ProgID="CorelDRAW.Graphic.11" ShapeID="_x0000_i1025" DrawAspect="Content" ObjectID="_1720242299" r:id="rId2"/>
       </w:object>
     </w:r>
     <w:r>

</xml_diff>